<commit_message>
Format source code and add final project documents
</commit_message>
<xml_diff>
--- a/docs/B01828711_Project_specification_updated.docx
+++ b/docs/B01828711_Project_specification_updated.docx
@@ -1,6 +1,6 @@
 
 <file path=word/document.xml><?xml version="1.0" encoding="utf-8"?>
-<w:document xmlns:wpc="http://schemas.microsoft.com/office/word/2010/wordprocessingCanvas" xmlns:cx="http://schemas.microsoft.com/office/drawing/2014/chartex" xmlns:cx1="http://schemas.microsoft.com/office/drawing/2015/9/8/chartex" xmlns:cx2="http://schemas.microsoft.com/office/drawing/2015/10/21/chartex" xmlns:cx3="http://schemas.microsoft.com/office/drawing/2016/5/9/chartex" xmlns:cx4="http://schemas.microsoft.com/office/drawing/2016/5/10/chartex" xmlns:cx5="http://schemas.microsoft.com/office/drawing/2016/5/11/chartex" xmlns:cx6="http://schemas.microsoft.com/office/drawing/2016/5/12/chartex" xmlns:cx7="http://schemas.microsoft.com/office/drawing/2016/5/13/chartex" xmlns:cx8="http://schemas.microsoft.com/office/drawing/2016/5/14/chartex" xmlns:mc="http://schemas.openxmlformats.org/markup-compatibility/2006" xmlns:aink="http://schemas.microsoft.com/office/drawing/2016/ink" xmlns:am3d="http://schemas.microsoft.com/office/drawing/2017/model3d" xmlns:o="urn:schemas-microsoft-com:office:office" xmlns:oel="http://schemas.microsoft.com/office/2019/extlst" xmlns:r="http://schemas.openxmlformats.org/officeDocument/2006/relationships" xmlns:m="http://schemas.openxmlformats.org/officeDocument/2006/math" xmlns:v="urn:schemas-microsoft-com:vml" xmlns:wp14="http://schemas.microsoft.com/office/word/2010/wordprocessingDrawing" xmlns:wp="http://schemas.openxmlformats.org/drawingml/2006/wordprocessingDrawing" xmlns:w10="urn:schemas-microsoft-com:office:word" xmlns:w="http://schemas.openxmlformats.org/wordprocessingml/2006/main" xmlns:w14="http://schemas.microsoft.com/office/word/2010/wordml" xmlns:w15="http://schemas.microsoft.com/office/word/2012/wordml" xmlns:w16cex="http://schemas.microsoft.com/office/word/2018/wordml/cex" xmlns:w16cid="http://schemas.microsoft.com/office/word/2016/wordml/cid" xmlns:w16="http://schemas.microsoft.com/office/word/2018/wordml" xmlns:w16du="http://schemas.microsoft.com/office/word/2023/wordml/word16du" xmlns:w16sdtdh="http://schemas.microsoft.com/office/word/2020/wordml/sdtdatahash" xmlns:w16sdtfl="http://schemas.microsoft.com/office/word/2024/wordml/sdtformatlock" xmlns:w16se="http://schemas.microsoft.com/office/word/2015/wordml/symex" xmlns:wpg="http://schemas.microsoft.com/office/word/2010/wordprocessingGroup" xmlns:wpi="http://schemas.microsoft.com/office/word/2010/wordprocessingInk" xmlns:wne="http://schemas.microsoft.com/office/word/2006/wordml" xmlns:wps="http://schemas.microsoft.com/office/word/2010/wordprocessingShape" mc:Ignorable="w14 w15 w16se w16cid w16 w16cex w16sdtdh w16sdtfl w16du wp14">
+<w:document xmlns:wpc="http://schemas.microsoft.com/office/word/2010/wordprocessingCanvas" xmlns:cx="http://schemas.microsoft.com/office/drawing/2014/chartex" xmlns:cx1="http://schemas.microsoft.com/office/drawing/2015/9/8/chartex" xmlns:cx2="http://schemas.microsoft.com/office/drawing/2015/10/21/chartex" xmlns:cx3="http://schemas.microsoft.com/office/drawing/2016/5/9/chartex" xmlns:cx4="http://schemas.microsoft.com/office/drawing/2016/5/10/chartex" xmlns:cx5="http://schemas.microsoft.com/office/drawing/2016/5/11/chartex" xmlns:cx6="http://schemas.microsoft.com/office/drawing/2016/5/12/chartex" xmlns:cx7="http://schemas.microsoft.com/office/drawing/2016/5/13/chartex" xmlns:cx8="http://schemas.microsoft.com/office/drawing/2016/5/14/chartex" xmlns:mc="http://schemas.openxmlformats.org/markup-compatibility/2006" xmlns:aink="http://schemas.microsoft.com/office/drawing/2016/ink" xmlns:am3d="http://schemas.microsoft.com/office/drawing/2017/model3d" xmlns:o="urn:schemas-microsoft-com:office:office" xmlns:oel="http://schemas.microsoft.com/office/2019/extlst" xmlns:r="http://schemas.openxmlformats.org/officeDocument/2006/relationships" xmlns:m="http://schemas.openxmlformats.org/officeDocument/2006/math" xmlns:v="urn:schemas-microsoft-com:vml" xmlns:wp14="http://schemas.microsoft.com/office/word/2010/wordprocessingDrawing" xmlns:wp="http://schemas.openxmlformats.org/drawingml/2006/wordprocessingDrawing" xmlns:w10="urn:schemas-microsoft-com:office:word" xmlns:w="http://schemas.openxmlformats.org/wordprocessingml/2006/main" xmlns:w14="http://schemas.microsoft.com/office/word/2010/wordml" xmlns:w15="http://schemas.microsoft.com/office/word/2012/wordml" xmlns:w16cei="http://schemas.microsoft.com/office/word/2026/wordml/cei" xmlns:w16cex="http://schemas.microsoft.com/office/word/2018/wordml/cex" xmlns:w16cid="http://schemas.microsoft.com/office/word/2016/wordml/cid" xmlns:w16="http://schemas.microsoft.com/office/word/2018/wordml" xmlns:w16du="http://schemas.microsoft.com/office/word/2023/wordml/word16du" xmlns:w16sdtdh="http://schemas.microsoft.com/office/word/2020/wordml/sdtdatahash" xmlns:w16sdtfl="http://schemas.microsoft.com/office/word/2024/wordml/sdtformatlock" xmlns:w16se="http://schemas.microsoft.com/office/word/2015/wordml/symex" xmlns:wpg="http://schemas.microsoft.com/office/word/2010/wordprocessingGroup" xmlns:wpi="http://schemas.microsoft.com/office/word/2010/wordprocessingInk" xmlns:wne="http://schemas.microsoft.com/office/word/2006/wordml" xmlns:wps="http://schemas.microsoft.com/office/word/2010/wordprocessingShape" mc:Ignorable="w14 w15 w16se w16cid w16 w16cex w16sdtdh w16sdtfl w16du wp14">
   <w:body>
     <w:p>
       <w:pPr>
@@ -4335,7 +4335,7 @@
 </file>
 
 <file path=word/endnotes.xml><?xml version="1.0" encoding="utf-8"?>
-<w:endnotes xmlns:wpc="http://schemas.microsoft.com/office/word/2010/wordprocessingCanvas" xmlns:cx="http://schemas.microsoft.com/office/drawing/2014/chartex" xmlns:cx1="http://schemas.microsoft.com/office/drawing/2015/9/8/chartex" xmlns:cx2="http://schemas.microsoft.com/office/drawing/2015/10/21/chartex" xmlns:cx3="http://schemas.microsoft.com/office/drawing/2016/5/9/chartex" xmlns:cx4="http://schemas.microsoft.com/office/drawing/2016/5/10/chartex" xmlns:cx5="http://schemas.microsoft.com/office/drawing/2016/5/11/chartex" xmlns:cx6="http://schemas.microsoft.com/office/drawing/2016/5/12/chartex" xmlns:cx7="http://schemas.microsoft.com/office/drawing/2016/5/13/chartex" xmlns:cx8="http://schemas.microsoft.com/office/drawing/2016/5/14/chartex" xmlns:mc="http://schemas.openxmlformats.org/markup-compatibility/2006" xmlns:aink="http://schemas.microsoft.com/office/drawing/2016/ink" xmlns:am3d="http://schemas.microsoft.com/office/drawing/2017/model3d" xmlns:o="urn:schemas-microsoft-com:office:office" xmlns:oel="http://schemas.microsoft.com/office/2019/extlst" xmlns:r="http://schemas.openxmlformats.org/officeDocument/2006/relationships" xmlns:m="http://schemas.openxmlformats.org/officeDocument/2006/math" xmlns:v="urn:schemas-microsoft-com:vml" xmlns:wp14="http://schemas.microsoft.com/office/word/2010/wordprocessingDrawing" xmlns:wp="http://schemas.openxmlformats.org/drawingml/2006/wordprocessingDrawing" xmlns:w10="urn:schemas-microsoft-com:office:word" xmlns:w="http://schemas.openxmlformats.org/wordprocessingml/2006/main" xmlns:w14="http://schemas.microsoft.com/office/word/2010/wordml" xmlns:w15="http://schemas.microsoft.com/office/word/2012/wordml" xmlns:w16cex="http://schemas.microsoft.com/office/word/2018/wordml/cex" xmlns:w16cid="http://schemas.microsoft.com/office/word/2016/wordml/cid" xmlns:w16="http://schemas.microsoft.com/office/word/2018/wordml" xmlns:w16du="http://schemas.microsoft.com/office/word/2023/wordml/word16du" xmlns:w16sdtdh="http://schemas.microsoft.com/office/word/2020/wordml/sdtdatahash" xmlns:w16sdtfl="http://schemas.microsoft.com/office/word/2024/wordml/sdtformatlock" xmlns:w16se="http://schemas.microsoft.com/office/word/2015/wordml/symex" xmlns:wpg="http://schemas.microsoft.com/office/word/2010/wordprocessingGroup" xmlns:wpi="http://schemas.microsoft.com/office/word/2010/wordprocessingInk" xmlns:wne="http://schemas.microsoft.com/office/word/2006/wordml" xmlns:wps="http://schemas.microsoft.com/office/word/2010/wordprocessingShape" mc:Ignorable="w14 w15 w16se w16cid w16 w16cex w16sdtdh w16sdtfl w16du wp14">
+<w:endnotes xmlns:wpc="http://schemas.microsoft.com/office/word/2010/wordprocessingCanvas" xmlns:cx="http://schemas.microsoft.com/office/drawing/2014/chartex" xmlns:cx1="http://schemas.microsoft.com/office/drawing/2015/9/8/chartex" xmlns:cx2="http://schemas.microsoft.com/office/drawing/2015/10/21/chartex" xmlns:cx3="http://schemas.microsoft.com/office/drawing/2016/5/9/chartex" xmlns:cx4="http://schemas.microsoft.com/office/drawing/2016/5/10/chartex" xmlns:cx5="http://schemas.microsoft.com/office/drawing/2016/5/11/chartex" xmlns:cx6="http://schemas.microsoft.com/office/drawing/2016/5/12/chartex" xmlns:cx7="http://schemas.microsoft.com/office/drawing/2016/5/13/chartex" xmlns:cx8="http://schemas.microsoft.com/office/drawing/2016/5/14/chartex" xmlns:mc="http://schemas.openxmlformats.org/markup-compatibility/2006" xmlns:aink="http://schemas.microsoft.com/office/drawing/2016/ink" xmlns:am3d="http://schemas.microsoft.com/office/drawing/2017/model3d" xmlns:o="urn:schemas-microsoft-com:office:office" xmlns:oel="http://schemas.microsoft.com/office/2019/extlst" xmlns:r="http://schemas.openxmlformats.org/officeDocument/2006/relationships" xmlns:m="http://schemas.openxmlformats.org/officeDocument/2006/math" xmlns:v="urn:schemas-microsoft-com:vml" xmlns:wp14="http://schemas.microsoft.com/office/word/2010/wordprocessingDrawing" xmlns:wp="http://schemas.openxmlformats.org/drawingml/2006/wordprocessingDrawing" xmlns:w10="urn:schemas-microsoft-com:office:word" xmlns:w="http://schemas.openxmlformats.org/wordprocessingml/2006/main" xmlns:w14="http://schemas.microsoft.com/office/word/2010/wordml" xmlns:w15="http://schemas.microsoft.com/office/word/2012/wordml" xmlns:w16cei="http://schemas.microsoft.com/office/word/2026/wordml/cei" xmlns:w16cex="http://schemas.microsoft.com/office/word/2018/wordml/cex" xmlns:w16cid="http://schemas.microsoft.com/office/word/2016/wordml/cid" xmlns:w16="http://schemas.microsoft.com/office/word/2018/wordml" xmlns:w16du="http://schemas.microsoft.com/office/word/2023/wordml/word16du" xmlns:w16sdtdh="http://schemas.microsoft.com/office/word/2020/wordml/sdtdatahash" xmlns:w16sdtfl="http://schemas.microsoft.com/office/word/2024/wordml/sdtformatlock" xmlns:w16se="http://schemas.microsoft.com/office/word/2015/wordml/symex" xmlns:wpg="http://schemas.microsoft.com/office/word/2010/wordprocessingGroup" xmlns:wpi="http://schemas.microsoft.com/office/word/2010/wordprocessingInk" xmlns:wne="http://schemas.microsoft.com/office/word/2006/wordml" xmlns:wps="http://schemas.microsoft.com/office/word/2010/wordprocessingShape" mc:Ignorable="w14 w15 w16se w16cid w16 w16cex w16sdtdh w16sdtfl w16du wp14">
   <w:endnote w:type="separator" w:id="-1">
     <w:p>
       <w:r>
@@ -4354,7 +4354,7 @@
 </file>
 
 <file path=word/footer1.xml><?xml version="1.0" encoding="utf-8"?>
-<w:ftr xmlns:wpc="http://schemas.microsoft.com/office/word/2010/wordprocessingCanvas" xmlns:cx="http://schemas.microsoft.com/office/drawing/2014/chartex" xmlns:cx1="http://schemas.microsoft.com/office/drawing/2015/9/8/chartex" xmlns:cx2="http://schemas.microsoft.com/office/drawing/2015/10/21/chartex" xmlns:cx3="http://schemas.microsoft.com/office/drawing/2016/5/9/chartex" xmlns:cx4="http://schemas.microsoft.com/office/drawing/2016/5/10/chartex" xmlns:cx5="http://schemas.microsoft.com/office/drawing/2016/5/11/chartex" xmlns:cx6="http://schemas.microsoft.com/office/drawing/2016/5/12/chartex" xmlns:cx7="http://schemas.microsoft.com/office/drawing/2016/5/13/chartex" xmlns:cx8="http://schemas.microsoft.com/office/drawing/2016/5/14/chartex" xmlns:mc="http://schemas.openxmlformats.org/markup-compatibility/2006" xmlns:aink="http://schemas.microsoft.com/office/drawing/2016/ink" xmlns:am3d="http://schemas.microsoft.com/office/drawing/2017/model3d" xmlns:o="urn:schemas-microsoft-com:office:office" xmlns:oel="http://schemas.microsoft.com/office/2019/extlst" xmlns:r="http://schemas.openxmlformats.org/officeDocument/2006/relationships" xmlns:m="http://schemas.openxmlformats.org/officeDocument/2006/math" xmlns:v="urn:schemas-microsoft-com:vml" xmlns:wp14="http://schemas.microsoft.com/office/word/2010/wordprocessingDrawing" xmlns:wp="http://schemas.openxmlformats.org/drawingml/2006/wordprocessingDrawing" xmlns:w10="urn:schemas-microsoft-com:office:word" xmlns:w="http://schemas.openxmlformats.org/wordprocessingml/2006/main" xmlns:w14="http://schemas.microsoft.com/office/word/2010/wordml" xmlns:w15="http://schemas.microsoft.com/office/word/2012/wordml" xmlns:w16cex="http://schemas.microsoft.com/office/word/2018/wordml/cex" xmlns:w16cid="http://schemas.microsoft.com/office/word/2016/wordml/cid" xmlns:w16="http://schemas.microsoft.com/office/word/2018/wordml" xmlns:w16du="http://schemas.microsoft.com/office/word/2023/wordml/word16du" xmlns:w16sdtdh="http://schemas.microsoft.com/office/word/2020/wordml/sdtdatahash" xmlns:w16sdtfl="http://schemas.microsoft.com/office/word/2024/wordml/sdtformatlock" xmlns:w16se="http://schemas.microsoft.com/office/word/2015/wordml/symex" xmlns:wpg="http://schemas.microsoft.com/office/word/2010/wordprocessingGroup" xmlns:wpi="http://schemas.microsoft.com/office/word/2010/wordprocessingInk" xmlns:wne="http://schemas.microsoft.com/office/word/2006/wordml" xmlns:wps="http://schemas.microsoft.com/office/word/2010/wordprocessingShape" mc:Ignorable="w14 w15 w16se w16cid w16 w16cex w16sdtdh w16sdtfl w16du wp14">
+<w:ftr xmlns:wpc="http://schemas.microsoft.com/office/word/2010/wordprocessingCanvas" xmlns:cx="http://schemas.microsoft.com/office/drawing/2014/chartex" xmlns:cx1="http://schemas.microsoft.com/office/drawing/2015/9/8/chartex" xmlns:cx2="http://schemas.microsoft.com/office/drawing/2015/10/21/chartex" xmlns:cx3="http://schemas.microsoft.com/office/drawing/2016/5/9/chartex" xmlns:cx4="http://schemas.microsoft.com/office/drawing/2016/5/10/chartex" xmlns:cx5="http://schemas.microsoft.com/office/drawing/2016/5/11/chartex" xmlns:cx6="http://schemas.microsoft.com/office/drawing/2016/5/12/chartex" xmlns:cx7="http://schemas.microsoft.com/office/drawing/2016/5/13/chartex" xmlns:cx8="http://schemas.microsoft.com/office/drawing/2016/5/14/chartex" xmlns:mc="http://schemas.openxmlformats.org/markup-compatibility/2006" xmlns:aink="http://schemas.microsoft.com/office/drawing/2016/ink" xmlns:am3d="http://schemas.microsoft.com/office/drawing/2017/model3d" xmlns:o="urn:schemas-microsoft-com:office:office" xmlns:oel="http://schemas.microsoft.com/office/2019/extlst" xmlns:r="http://schemas.openxmlformats.org/officeDocument/2006/relationships" xmlns:m="http://schemas.openxmlformats.org/officeDocument/2006/math" xmlns:v="urn:schemas-microsoft-com:vml" xmlns:wp14="http://schemas.microsoft.com/office/word/2010/wordprocessingDrawing" xmlns:wp="http://schemas.openxmlformats.org/drawingml/2006/wordprocessingDrawing" xmlns:w10="urn:schemas-microsoft-com:office:word" xmlns:w="http://schemas.openxmlformats.org/wordprocessingml/2006/main" xmlns:w14="http://schemas.microsoft.com/office/word/2010/wordml" xmlns:w15="http://schemas.microsoft.com/office/word/2012/wordml" xmlns:w16cei="http://schemas.microsoft.com/office/word/2026/wordml/cei" xmlns:w16cex="http://schemas.microsoft.com/office/word/2018/wordml/cex" xmlns:w16cid="http://schemas.microsoft.com/office/word/2016/wordml/cid" xmlns:w16="http://schemas.microsoft.com/office/word/2018/wordml" xmlns:w16du="http://schemas.microsoft.com/office/word/2023/wordml/word16du" xmlns:w16sdtdh="http://schemas.microsoft.com/office/word/2020/wordml/sdtdatahash" xmlns:w16sdtfl="http://schemas.microsoft.com/office/word/2024/wordml/sdtformatlock" xmlns:w16se="http://schemas.microsoft.com/office/word/2015/wordml/symex" xmlns:wpg="http://schemas.microsoft.com/office/word/2010/wordprocessingGroup" xmlns:wpi="http://schemas.microsoft.com/office/word/2010/wordprocessingInk" xmlns:wne="http://schemas.microsoft.com/office/word/2006/wordml" xmlns:wps="http://schemas.microsoft.com/office/word/2010/wordprocessingShape" mc:Ignorable="w14 w15 w16se w16cid w16 w16cex w16sdtdh w16sdtfl w16du wp14">
   <w:sdt>
     <w:sdtPr>
       <w:id w:val="80571002"/>
@@ -4407,7 +4407,7 @@
 </file>
 
 <file path=word/footnotes.xml><?xml version="1.0" encoding="utf-8"?>
-<w:footnotes xmlns:wpc="http://schemas.microsoft.com/office/word/2010/wordprocessingCanvas" xmlns:cx="http://schemas.microsoft.com/office/drawing/2014/chartex" xmlns:cx1="http://schemas.microsoft.com/office/drawing/2015/9/8/chartex" xmlns:cx2="http://schemas.microsoft.com/office/drawing/2015/10/21/chartex" xmlns:cx3="http://schemas.microsoft.com/office/drawing/2016/5/9/chartex" xmlns:cx4="http://schemas.microsoft.com/office/drawing/2016/5/10/chartex" xmlns:cx5="http://schemas.microsoft.com/office/drawing/2016/5/11/chartex" xmlns:cx6="http://schemas.microsoft.com/office/drawing/2016/5/12/chartex" xmlns:cx7="http://schemas.microsoft.com/office/drawing/2016/5/13/chartex" xmlns:cx8="http://schemas.microsoft.com/office/drawing/2016/5/14/chartex" xmlns:mc="http://schemas.openxmlformats.org/markup-compatibility/2006" xmlns:aink="http://schemas.microsoft.com/office/drawing/2016/ink" xmlns:am3d="http://schemas.microsoft.com/office/drawing/2017/model3d" xmlns:o="urn:schemas-microsoft-com:office:office" xmlns:oel="http://schemas.microsoft.com/office/2019/extlst" xmlns:r="http://schemas.openxmlformats.org/officeDocument/2006/relationships" xmlns:m="http://schemas.openxmlformats.org/officeDocument/2006/math" xmlns:v="urn:schemas-microsoft-com:vml" xmlns:wp14="http://schemas.microsoft.com/office/word/2010/wordprocessingDrawing" xmlns:wp="http://schemas.openxmlformats.org/drawingml/2006/wordprocessingDrawing" xmlns:w10="urn:schemas-microsoft-com:office:word" xmlns:w="http://schemas.openxmlformats.org/wordprocessingml/2006/main" xmlns:w14="http://schemas.microsoft.com/office/word/2010/wordml" xmlns:w15="http://schemas.microsoft.com/office/word/2012/wordml" xmlns:w16cex="http://schemas.microsoft.com/office/word/2018/wordml/cex" xmlns:w16cid="http://schemas.microsoft.com/office/word/2016/wordml/cid" xmlns:w16="http://schemas.microsoft.com/office/word/2018/wordml" xmlns:w16du="http://schemas.microsoft.com/office/word/2023/wordml/word16du" xmlns:w16sdtdh="http://schemas.microsoft.com/office/word/2020/wordml/sdtdatahash" xmlns:w16sdtfl="http://schemas.microsoft.com/office/word/2024/wordml/sdtformatlock" xmlns:w16se="http://schemas.microsoft.com/office/word/2015/wordml/symex" xmlns:wpg="http://schemas.microsoft.com/office/word/2010/wordprocessingGroup" xmlns:wpi="http://schemas.microsoft.com/office/word/2010/wordprocessingInk" xmlns:wne="http://schemas.microsoft.com/office/word/2006/wordml" xmlns:wps="http://schemas.microsoft.com/office/word/2010/wordprocessingShape" mc:Ignorable="w14 w15 w16se w16cid w16 w16cex w16sdtdh w16sdtfl w16du wp14">
+<w:footnotes xmlns:wpc="http://schemas.microsoft.com/office/word/2010/wordprocessingCanvas" xmlns:cx="http://schemas.microsoft.com/office/drawing/2014/chartex" xmlns:cx1="http://schemas.microsoft.com/office/drawing/2015/9/8/chartex" xmlns:cx2="http://schemas.microsoft.com/office/drawing/2015/10/21/chartex" xmlns:cx3="http://schemas.microsoft.com/office/drawing/2016/5/9/chartex" xmlns:cx4="http://schemas.microsoft.com/office/drawing/2016/5/10/chartex" xmlns:cx5="http://schemas.microsoft.com/office/drawing/2016/5/11/chartex" xmlns:cx6="http://schemas.microsoft.com/office/drawing/2016/5/12/chartex" xmlns:cx7="http://schemas.microsoft.com/office/drawing/2016/5/13/chartex" xmlns:cx8="http://schemas.microsoft.com/office/drawing/2016/5/14/chartex" xmlns:mc="http://schemas.openxmlformats.org/markup-compatibility/2006" xmlns:aink="http://schemas.microsoft.com/office/drawing/2016/ink" xmlns:am3d="http://schemas.microsoft.com/office/drawing/2017/model3d" xmlns:o="urn:schemas-microsoft-com:office:office" xmlns:oel="http://schemas.microsoft.com/office/2019/extlst" xmlns:r="http://schemas.openxmlformats.org/officeDocument/2006/relationships" xmlns:m="http://schemas.openxmlformats.org/officeDocument/2006/math" xmlns:v="urn:schemas-microsoft-com:vml" xmlns:wp14="http://schemas.microsoft.com/office/word/2010/wordprocessingDrawing" xmlns:wp="http://schemas.openxmlformats.org/drawingml/2006/wordprocessingDrawing" xmlns:w10="urn:schemas-microsoft-com:office:word" xmlns:w="http://schemas.openxmlformats.org/wordprocessingml/2006/main" xmlns:w14="http://schemas.microsoft.com/office/word/2010/wordml" xmlns:w15="http://schemas.microsoft.com/office/word/2012/wordml" xmlns:w16cei="http://schemas.microsoft.com/office/word/2026/wordml/cei" xmlns:w16cex="http://schemas.microsoft.com/office/word/2018/wordml/cex" xmlns:w16cid="http://schemas.microsoft.com/office/word/2016/wordml/cid" xmlns:w16="http://schemas.microsoft.com/office/word/2018/wordml" xmlns:w16du="http://schemas.microsoft.com/office/word/2023/wordml/word16du" xmlns:w16sdtdh="http://schemas.microsoft.com/office/word/2020/wordml/sdtdatahash" xmlns:w16sdtfl="http://schemas.microsoft.com/office/word/2024/wordml/sdtformatlock" xmlns:w16se="http://schemas.microsoft.com/office/word/2015/wordml/symex" xmlns:wpg="http://schemas.microsoft.com/office/word/2010/wordprocessingGroup" xmlns:wpi="http://schemas.microsoft.com/office/word/2010/wordprocessingInk" xmlns:wne="http://schemas.microsoft.com/office/word/2006/wordml" xmlns:wps="http://schemas.microsoft.com/office/word/2010/wordprocessingShape" mc:Ignorable="w14 w15 w16se w16cid w16 w16cex w16sdtdh w16sdtfl w16du wp14">
   <w:footnote w:type="separator" w:id="-1">
     <w:p>
       <w:r>
@@ -4426,7 +4426,7 @@
 </file>
 
 <file path=word/header1.xml><?xml version="1.0" encoding="utf-8"?>
-<w:hdr xmlns:wpc="http://schemas.microsoft.com/office/word/2010/wordprocessingCanvas" xmlns:cx="http://schemas.microsoft.com/office/drawing/2014/chartex" xmlns:cx1="http://schemas.microsoft.com/office/drawing/2015/9/8/chartex" xmlns:cx2="http://schemas.microsoft.com/office/drawing/2015/10/21/chartex" xmlns:cx3="http://schemas.microsoft.com/office/drawing/2016/5/9/chartex" xmlns:cx4="http://schemas.microsoft.com/office/drawing/2016/5/10/chartex" xmlns:cx5="http://schemas.microsoft.com/office/drawing/2016/5/11/chartex" xmlns:cx6="http://schemas.microsoft.com/office/drawing/2016/5/12/chartex" xmlns:cx7="http://schemas.microsoft.com/office/drawing/2016/5/13/chartex" xmlns:cx8="http://schemas.microsoft.com/office/drawing/2016/5/14/chartex" xmlns:mc="http://schemas.openxmlformats.org/markup-compatibility/2006" xmlns:aink="http://schemas.microsoft.com/office/drawing/2016/ink" xmlns:am3d="http://schemas.microsoft.com/office/drawing/2017/model3d" xmlns:o="urn:schemas-microsoft-com:office:office" xmlns:oel="http://schemas.microsoft.com/office/2019/extlst" xmlns:r="http://schemas.openxmlformats.org/officeDocument/2006/relationships" xmlns:m="http://schemas.openxmlformats.org/officeDocument/2006/math" xmlns:v="urn:schemas-microsoft-com:vml" xmlns:wp14="http://schemas.microsoft.com/office/word/2010/wordprocessingDrawing" xmlns:wp="http://schemas.openxmlformats.org/drawingml/2006/wordprocessingDrawing" xmlns:w10="urn:schemas-microsoft-com:office:word" xmlns:w="http://schemas.openxmlformats.org/wordprocessingml/2006/main" xmlns:w14="http://schemas.microsoft.com/office/word/2010/wordml" xmlns:w15="http://schemas.microsoft.com/office/word/2012/wordml" xmlns:w16cex="http://schemas.microsoft.com/office/word/2018/wordml/cex" xmlns:w16cid="http://schemas.microsoft.com/office/word/2016/wordml/cid" xmlns:w16="http://schemas.microsoft.com/office/word/2018/wordml" xmlns:w16du="http://schemas.microsoft.com/office/word/2023/wordml/word16du" xmlns:w16sdtdh="http://schemas.microsoft.com/office/word/2020/wordml/sdtdatahash" xmlns:w16sdtfl="http://schemas.microsoft.com/office/word/2024/wordml/sdtformatlock" xmlns:w16se="http://schemas.microsoft.com/office/word/2015/wordml/symex" xmlns:wpg="http://schemas.microsoft.com/office/word/2010/wordprocessingGroup" xmlns:wpi="http://schemas.microsoft.com/office/word/2010/wordprocessingInk" xmlns:wne="http://schemas.microsoft.com/office/word/2006/wordml" xmlns:wps="http://schemas.microsoft.com/office/word/2010/wordprocessingShape" mc:Ignorable="w14 w15 w16se w16cid w16 w16cex w16sdtdh w16sdtfl w16du wp14">
+<w:hdr xmlns:wpc="http://schemas.microsoft.com/office/word/2010/wordprocessingCanvas" xmlns:cx="http://schemas.microsoft.com/office/drawing/2014/chartex" xmlns:cx1="http://schemas.microsoft.com/office/drawing/2015/9/8/chartex" xmlns:cx2="http://schemas.microsoft.com/office/drawing/2015/10/21/chartex" xmlns:cx3="http://schemas.microsoft.com/office/drawing/2016/5/9/chartex" xmlns:cx4="http://schemas.microsoft.com/office/drawing/2016/5/10/chartex" xmlns:cx5="http://schemas.microsoft.com/office/drawing/2016/5/11/chartex" xmlns:cx6="http://schemas.microsoft.com/office/drawing/2016/5/12/chartex" xmlns:cx7="http://schemas.microsoft.com/office/drawing/2016/5/13/chartex" xmlns:cx8="http://schemas.microsoft.com/office/drawing/2016/5/14/chartex" xmlns:mc="http://schemas.openxmlformats.org/markup-compatibility/2006" xmlns:aink="http://schemas.microsoft.com/office/drawing/2016/ink" xmlns:am3d="http://schemas.microsoft.com/office/drawing/2017/model3d" xmlns:o="urn:schemas-microsoft-com:office:office" xmlns:oel="http://schemas.microsoft.com/office/2019/extlst" xmlns:r="http://schemas.openxmlformats.org/officeDocument/2006/relationships" xmlns:m="http://schemas.openxmlformats.org/officeDocument/2006/math" xmlns:v="urn:schemas-microsoft-com:vml" xmlns:wp14="http://schemas.microsoft.com/office/word/2010/wordprocessingDrawing" xmlns:wp="http://schemas.openxmlformats.org/drawingml/2006/wordprocessingDrawing" xmlns:w10="urn:schemas-microsoft-com:office:word" xmlns:w="http://schemas.openxmlformats.org/wordprocessingml/2006/main" xmlns:w14="http://schemas.microsoft.com/office/word/2010/wordml" xmlns:w15="http://schemas.microsoft.com/office/word/2012/wordml" xmlns:w16cei="http://schemas.microsoft.com/office/word/2026/wordml/cei" xmlns:w16cex="http://schemas.microsoft.com/office/word/2018/wordml/cex" xmlns:w16cid="http://schemas.microsoft.com/office/word/2016/wordml/cid" xmlns:w16="http://schemas.microsoft.com/office/word/2018/wordml" xmlns:w16du="http://schemas.microsoft.com/office/word/2023/wordml/word16du" xmlns:w16sdtdh="http://schemas.microsoft.com/office/word/2020/wordml/sdtdatahash" xmlns:w16sdtfl="http://schemas.microsoft.com/office/word/2024/wordml/sdtformatlock" xmlns:w16se="http://schemas.microsoft.com/office/word/2015/wordml/symex" xmlns:wpg="http://schemas.microsoft.com/office/word/2010/wordprocessingGroup" xmlns:wpi="http://schemas.microsoft.com/office/word/2010/wordprocessingInk" xmlns:wne="http://schemas.microsoft.com/office/word/2006/wordml" xmlns:wps="http://schemas.microsoft.com/office/word/2010/wordprocessingShape" mc:Ignorable="w14 w15 w16se w16cid w16 w16cex w16sdtdh w16sdtfl w16du wp14">
   <w:tbl>
     <w:tblPr>
       <w:tblW w:w="5238" w:type="pct"/>
@@ -4634,7 +4634,7 @@
 </file>
 
 <file path=word/numbering.xml><?xml version="1.0" encoding="utf-8"?>
-<w:numbering xmlns:wpc="http://schemas.microsoft.com/office/word/2010/wordprocessingCanvas" xmlns:cx="http://schemas.microsoft.com/office/drawing/2014/chartex" xmlns:cx1="http://schemas.microsoft.com/office/drawing/2015/9/8/chartex" xmlns:cx2="http://schemas.microsoft.com/office/drawing/2015/10/21/chartex" xmlns:cx3="http://schemas.microsoft.com/office/drawing/2016/5/9/chartex" xmlns:cx4="http://schemas.microsoft.com/office/drawing/2016/5/10/chartex" xmlns:cx5="http://schemas.microsoft.com/office/drawing/2016/5/11/chartex" xmlns:cx6="http://schemas.microsoft.com/office/drawing/2016/5/12/chartex" xmlns:cx7="http://schemas.microsoft.com/office/drawing/2016/5/13/chartex" xmlns:cx8="http://schemas.microsoft.com/office/drawing/2016/5/14/chartex" xmlns:mc="http://schemas.openxmlformats.org/markup-compatibility/2006" xmlns:aink="http://schemas.microsoft.com/office/drawing/2016/ink" xmlns:am3d="http://schemas.microsoft.com/office/drawing/2017/model3d" xmlns:o="urn:schemas-microsoft-com:office:office" xmlns:oel="http://schemas.microsoft.com/office/2019/extlst" xmlns:r="http://schemas.openxmlformats.org/officeDocument/2006/relationships" xmlns:m="http://schemas.openxmlformats.org/officeDocument/2006/math" xmlns:v="urn:schemas-microsoft-com:vml" xmlns:wp14="http://schemas.microsoft.com/office/word/2010/wordprocessingDrawing" xmlns:wp="http://schemas.openxmlformats.org/drawingml/2006/wordprocessingDrawing" xmlns:w10="urn:schemas-microsoft-com:office:word" xmlns:w="http://schemas.openxmlformats.org/wordprocessingml/2006/main" xmlns:w14="http://schemas.microsoft.com/office/word/2010/wordml" xmlns:w15="http://schemas.microsoft.com/office/word/2012/wordml" xmlns:w16cex="http://schemas.microsoft.com/office/word/2018/wordml/cex" xmlns:w16cid="http://schemas.microsoft.com/office/word/2016/wordml/cid" xmlns:w16="http://schemas.microsoft.com/office/word/2018/wordml" xmlns:w16du="http://schemas.microsoft.com/office/word/2023/wordml/word16du" xmlns:w16sdtdh="http://schemas.microsoft.com/office/word/2020/wordml/sdtdatahash" xmlns:w16sdtfl="http://schemas.microsoft.com/office/word/2024/wordml/sdtformatlock" xmlns:w16se="http://schemas.microsoft.com/office/word/2015/wordml/symex" xmlns:wpg="http://schemas.microsoft.com/office/word/2010/wordprocessingGroup" xmlns:wpi="http://schemas.microsoft.com/office/word/2010/wordprocessingInk" xmlns:wne="http://schemas.microsoft.com/office/word/2006/wordml" xmlns:wps="http://schemas.microsoft.com/office/word/2010/wordprocessingShape" mc:Ignorable="w14 w15 w16se w16cid w16 w16cex w16sdtdh w16sdtfl w16du wp14">
+<w:numbering xmlns:wpc="http://schemas.microsoft.com/office/word/2010/wordprocessingCanvas" xmlns:cx="http://schemas.microsoft.com/office/drawing/2014/chartex" xmlns:cx1="http://schemas.microsoft.com/office/drawing/2015/9/8/chartex" xmlns:cx2="http://schemas.microsoft.com/office/drawing/2015/10/21/chartex" xmlns:cx3="http://schemas.microsoft.com/office/drawing/2016/5/9/chartex" xmlns:cx4="http://schemas.microsoft.com/office/drawing/2016/5/10/chartex" xmlns:cx5="http://schemas.microsoft.com/office/drawing/2016/5/11/chartex" xmlns:cx6="http://schemas.microsoft.com/office/drawing/2016/5/12/chartex" xmlns:cx7="http://schemas.microsoft.com/office/drawing/2016/5/13/chartex" xmlns:cx8="http://schemas.microsoft.com/office/drawing/2016/5/14/chartex" xmlns:mc="http://schemas.openxmlformats.org/markup-compatibility/2006" xmlns:aink="http://schemas.microsoft.com/office/drawing/2016/ink" xmlns:am3d="http://schemas.microsoft.com/office/drawing/2017/model3d" xmlns:o="urn:schemas-microsoft-com:office:office" xmlns:oel="http://schemas.microsoft.com/office/2019/extlst" xmlns:r="http://schemas.openxmlformats.org/officeDocument/2006/relationships" xmlns:m="http://schemas.openxmlformats.org/officeDocument/2006/math" xmlns:v="urn:schemas-microsoft-com:vml" xmlns:wp14="http://schemas.microsoft.com/office/word/2010/wordprocessingDrawing" xmlns:wp="http://schemas.openxmlformats.org/drawingml/2006/wordprocessingDrawing" xmlns:w10="urn:schemas-microsoft-com:office:word" xmlns:w="http://schemas.openxmlformats.org/wordprocessingml/2006/main" xmlns:w14="http://schemas.microsoft.com/office/word/2010/wordml" xmlns:w15="http://schemas.microsoft.com/office/word/2012/wordml" xmlns:w16cei="http://schemas.microsoft.com/office/word/2026/wordml/cei" xmlns:w16cex="http://schemas.microsoft.com/office/word/2018/wordml/cex" xmlns:w16cid="http://schemas.microsoft.com/office/word/2016/wordml/cid" xmlns:w16="http://schemas.microsoft.com/office/word/2018/wordml" xmlns:w16du="http://schemas.microsoft.com/office/word/2023/wordml/word16du" xmlns:w16sdtdh="http://schemas.microsoft.com/office/word/2020/wordml/sdtdatahash" xmlns:w16sdtfl="http://schemas.microsoft.com/office/word/2024/wordml/sdtformatlock" xmlns:w16se="http://schemas.microsoft.com/office/word/2015/wordml/symex" xmlns:wpg="http://schemas.microsoft.com/office/word/2010/wordprocessingGroup" xmlns:wpi="http://schemas.microsoft.com/office/word/2010/wordprocessingInk" xmlns:wne="http://schemas.microsoft.com/office/word/2006/wordml" xmlns:wps="http://schemas.microsoft.com/office/word/2010/wordprocessingShape" mc:Ignorable="w14 w15 w16se w16cid w16 w16cex w16sdtdh w16sdtfl w16du wp14">
   <w:abstractNum w:abstractNumId="0" w15:restartNumberingAfterBreak="0">
     <w:nsid w:val="0EA34327"/>
     <w:multiLevelType w:val="hybridMultilevel"/>
@@ -5870,7 +5870,7 @@
 </file>
 
 <file path=word/glossary/document.xml><?xml version="1.0" encoding="utf-8"?>
-<w:glossaryDocument xmlns:wpc="http://schemas.microsoft.com/office/word/2010/wordprocessingCanvas" xmlns:cx="http://schemas.microsoft.com/office/drawing/2014/chartex" xmlns:cx1="http://schemas.microsoft.com/office/drawing/2015/9/8/chartex" xmlns:cx2="http://schemas.microsoft.com/office/drawing/2015/10/21/chartex" xmlns:cx3="http://schemas.microsoft.com/office/drawing/2016/5/9/chartex" xmlns:cx4="http://schemas.microsoft.com/office/drawing/2016/5/10/chartex" xmlns:cx5="http://schemas.microsoft.com/office/drawing/2016/5/11/chartex" xmlns:cx6="http://schemas.microsoft.com/office/drawing/2016/5/12/chartex" xmlns:cx7="http://schemas.microsoft.com/office/drawing/2016/5/13/chartex" xmlns:cx8="http://schemas.microsoft.com/office/drawing/2016/5/14/chartex" xmlns:mc="http://schemas.openxmlformats.org/markup-compatibility/2006" xmlns:aink="http://schemas.microsoft.com/office/drawing/2016/ink" xmlns:am3d="http://schemas.microsoft.com/office/drawing/2017/model3d" xmlns:o="urn:schemas-microsoft-com:office:office" xmlns:oel="http://schemas.microsoft.com/office/2019/extlst" xmlns:r="http://schemas.openxmlformats.org/officeDocument/2006/relationships" xmlns:m="http://schemas.openxmlformats.org/officeDocument/2006/math" xmlns:v="urn:schemas-microsoft-com:vml" xmlns:wp14="http://schemas.microsoft.com/office/word/2010/wordprocessingDrawing" xmlns:wp="http://schemas.openxmlformats.org/drawingml/2006/wordprocessingDrawing" xmlns:w10="urn:schemas-microsoft-com:office:word" xmlns:w="http://schemas.openxmlformats.org/wordprocessingml/2006/main" xmlns:w14="http://schemas.microsoft.com/office/word/2010/wordml" xmlns:w15="http://schemas.microsoft.com/office/word/2012/wordml" xmlns:w16cex="http://schemas.microsoft.com/office/word/2018/wordml/cex" xmlns:w16cid="http://schemas.microsoft.com/office/word/2016/wordml/cid" xmlns:w16="http://schemas.microsoft.com/office/word/2018/wordml" xmlns:w16du="http://schemas.microsoft.com/office/word/2023/wordml/word16du" xmlns:w16sdtdh="http://schemas.microsoft.com/office/word/2020/wordml/sdtdatahash" xmlns:w16sdtfl="http://schemas.microsoft.com/office/word/2024/wordml/sdtformatlock" xmlns:w16se="http://schemas.microsoft.com/office/word/2015/wordml/symex" xmlns:wpg="http://schemas.microsoft.com/office/word/2010/wordprocessingGroup" xmlns:wpi="http://schemas.microsoft.com/office/word/2010/wordprocessingInk" xmlns:wne="http://schemas.microsoft.com/office/word/2006/wordml" xmlns:wps="http://schemas.microsoft.com/office/word/2010/wordprocessingShape" mc:Ignorable="w14 w15 w16se w16cid w16 w16cex w16sdtdh w16sdtfl w16du wp14">
+<w:glossaryDocument xmlns:wpc="http://schemas.microsoft.com/office/word/2010/wordprocessingCanvas" xmlns:cx="http://schemas.microsoft.com/office/drawing/2014/chartex" xmlns:cx1="http://schemas.microsoft.com/office/drawing/2015/9/8/chartex" xmlns:cx2="http://schemas.microsoft.com/office/drawing/2015/10/21/chartex" xmlns:cx3="http://schemas.microsoft.com/office/drawing/2016/5/9/chartex" xmlns:cx4="http://schemas.microsoft.com/office/drawing/2016/5/10/chartex" xmlns:cx5="http://schemas.microsoft.com/office/drawing/2016/5/11/chartex" xmlns:cx6="http://schemas.microsoft.com/office/drawing/2016/5/12/chartex" xmlns:cx7="http://schemas.microsoft.com/office/drawing/2016/5/13/chartex" xmlns:cx8="http://schemas.microsoft.com/office/drawing/2016/5/14/chartex" xmlns:mc="http://schemas.openxmlformats.org/markup-compatibility/2006" xmlns:aink="http://schemas.microsoft.com/office/drawing/2016/ink" xmlns:am3d="http://schemas.microsoft.com/office/drawing/2017/model3d" xmlns:o="urn:schemas-microsoft-com:office:office" xmlns:oel="http://schemas.microsoft.com/office/2019/extlst" xmlns:r="http://schemas.openxmlformats.org/officeDocument/2006/relationships" xmlns:m="http://schemas.openxmlformats.org/officeDocument/2006/math" xmlns:v="urn:schemas-microsoft-com:vml" xmlns:wp14="http://schemas.microsoft.com/office/word/2010/wordprocessingDrawing" xmlns:wp="http://schemas.openxmlformats.org/drawingml/2006/wordprocessingDrawing" xmlns:w10="urn:schemas-microsoft-com:office:word" xmlns:w="http://schemas.openxmlformats.org/wordprocessingml/2006/main" xmlns:w14="http://schemas.microsoft.com/office/word/2010/wordml" xmlns:w15="http://schemas.microsoft.com/office/word/2012/wordml" xmlns:w16cei="http://schemas.microsoft.com/office/word/2026/wordml/cei" xmlns:w16cex="http://schemas.microsoft.com/office/word/2018/wordml/cex" xmlns:w16cid="http://schemas.microsoft.com/office/word/2016/wordml/cid" xmlns:w16="http://schemas.microsoft.com/office/word/2018/wordml" xmlns:w16du="http://schemas.microsoft.com/office/word/2023/wordml/word16du" xmlns:w16sdtdh="http://schemas.microsoft.com/office/word/2020/wordml/sdtdatahash" xmlns:w16sdtfl="http://schemas.microsoft.com/office/word/2024/wordml/sdtformatlock" xmlns:w16se="http://schemas.microsoft.com/office/word/2015/wordml/symex" xmlns:wpg="http://schemas.microsoft.com/office/word/2010/wordprocessingGroup" xmlns:wpi="http://schemas.microsoft.com/office/word/2010/wordprocessingInk" xmlns:wne="http://schemas.microsoft.com/office/word/2006/wordml" xmlns:wps="http://schemas.microsoft.com/office/word/2010/wordprocessingShape" mc:Ignorable="w14 w15 w16se w16cid w16 w16cex w16sdtdh w16sdtfl w16du wp14">
   <w:docParts>
     <w:docPart>
       <w:docPartPr>
@@ -6170,9 +6170,11 @@
     <w:rsid w:val="001237AC"/>
     <w:rsid w:val="0014590D"/>
     <w:rsid w:val="0021192D"/>
+    <w:rsid w:val="003C07FE"/>
     <w:rsid w:val="004928D8"/>
     <w:rsid w:val="006F19F6"/>
     <w:rsid w:val="00726DAF"/>
+    <w:rsid w:val="007B0B6C"/>
     <w:rsid w:val="008B2ED1"/>
     <w:rsid w:val="008E2A67"/>
     <w:rsid w:val="00931BD7"/>
@@ -7213,7 +7215,12 @@
 </file>
 
 <file path=customXml/item3.xml><?xml version="1.0" encoding="utf-8"?>
-<b:Sources xmlns:b="http://schemas.openxmlformats.org/officeDocument/2006/bibliography" xmlns="http://schemas.openxmlformats.org/officeDocument/2006/bibliography" SelectedStyle="\APA.XSL" StyleName="APA"/>
+<?mso-contentType ?>
+<FormTemplates xmlns="http://schemas.microsoft.com/sharepoint/v3/contenttype/forms">
+  <Display>DocumentLibraryForm</Display>
+  <Edit>DocumentLibraryForm</Edit>
+  <New>DocumentLibraryForm</New>
+</FormTemplates>
 </file>
 
 <file path=customXml/item4.xml><?xml version="1.0" encoding="utf-8"?>
@@ -7223,12 +7230,7 @@
 </file>
 
 <file path=customXml/item5.xml><?xml version="1.0" encoding="utf-8"?>
-<?mso-contentType ?>
-<FormTemplates xmlns="http://schemas.microsoft.com/sharepoint/v3/contenttype/forms">
-  <Display>DocumentLibraryForm</Display>
-  <Edit>DocumentLibraryForm</Edit>
-  <New>DocumentLibraryForm</New>
-</FormTemplates>
+<b:Sources xmlns:b="http://schemas.openxmlformats.org/officeDocument/2006/bibliography" xmlns="http://schemas.openxmlformats.org/officeDocument/2006/bibliography" SelectedStyle="\APA.XSL" StyleName="APA"/>
 </file>
 
 <file path=customXml/itemProps1.xml><?xml version="1.0" encoding="utf-8"?>
@@ -7259,9 +7261,9 @@
 </file>
 
 <file path=customXml/itemProps3.xml><?xml version="1.0" encoding="utf-8"?>
-<ds:datastoreItem xmlns:ds="http://schemas.openxmlformats.org/officeDocument/2006/customXml" ds:itemID="{44DFFA93-1B74-4040-8356-B6208A531807}">
+<ds:datastoreItem xmlns:ds="http://schemas.openxmlformats.org/officeDocument/2006/customXml" ds:itemID="{CD0E8819-C2F8-4441-B799-D2C92E2DBC6B}">
   <ds:schemaRefs>
-    <ds:schemaRef ds:uri="http://schemas.openxmlformats.org/officeDocument/2006/bibliography"/>
+    <ds:schemaRef ds:uri="http://schemas.microsoft.com/sharepoint/v3/contenttype/forms"/>
   </ds:schemaRefs>
 </ds:datastoreItem>
 </file>
@@ -7276,9 +7278,9 @@
 </file>
 
 <file path=customXml/itemProps5.xml><?xml version="1.0" encoding="utf-8"?>
-<ds:datastoreItem xmlns:ds="http://schemas.openxmlformats.org/officeDocument/2006/customXml" ds:itemID="{CD0E8819-C2F8-4441-B799-D2C92E2DBC6B}">
+<ds:datastoreItem xmlns:ds="http://schemas.openxmlformats.org/officeDocument/2006/customXml" ds:itemID="{44DFFA93-1B74-4040-8356-B6208A531807}">
   <ds:schemaRefs>
-    <ds:schemaRef ds:uri="http://schemas.microsoft.com/sharepoint/v3/contenttype/forms"/>
+    <ds:schemaRef ds:uri="http://schemas.openxmlformats.org/officeDocument/2006/bibliography"/>
   </ds:schemaRefs>
 </ds:datastoreItem>
 </file>

</xml_diff>